<commit_message>
feat(GateOverflow-Chatbot): GateOverflow platform awareness + demo videos updated
- The assistant now knows the gateoverflow.in platform itself (pages, PYQ
  database, advanced search syntax, online PDF Book Viewer, test series, rank
  predictor, badges, how to ask) — via a system-prompt overview plus a new
  knowledge file data/seed/gateoverflow_platform_guide.md (researched from the
  live site). Users can ask how to use the site while studying.
- Demo videos rebuilt from real footage to include the new "Knows the
  GateOverflow platform" scene:
  - GateOverflow-Chatbot-Feature-Guide.mp4 (detailed, 24 scenes, ~7:45)
  - GateOverflow-Chatbot-Demo.mp4 (concise, 16 scenes, ~3:25)
- Regenerated documentation DOCX + DEMO_SCRIPT + demo/live still.

Co-Authored-By: Claude Opus 4.8 (1M context) <noreply@anthropic.com>
</commit_message>
<xml_diff>
--- a/18.Utilities/E.GATE-CS-DA-Chatbot/demo/GateOverflow-Chatbot-Demo.docx
+++ b/18.Utilities/E.GATE-CS-DA-Chatbot/demo/GateOverflow-Chatbot-Demo.docx
@@ -1220,6 +1220,21 @@
         <w:rPr>
           <w:b/>
         </w:rPr>
+        <w:t>GateOverflow platform awareness</w:t>
+      </w:r>
+      <w:r>
+        <w:t xml:space="preserve"> — the assistant also knows the gateoverflow.in website itself — its pages, the PYQ database, advanced search syntax, the online PDF Book Viewer, test series, rank predictor, badges and how to ask — so it can guide users around the site while they study.</w:t>
+      </w:r>
+    </w:p>
+    <w:p>
+      <w:pPr>
+        <w:pStyle w:val="ListBullet"/>
+        <w:ind w:left="360"/>
+      </w:pPr>
+      <w:r>
+        <w:rPr>
+          <w:b/>
+        </w:rPr>
         <w:t>Direct GateOverflow PYQ links</w:t>
       </w:r>
       <w:r>

</xml_diff>

<commit_message>
docs(GateOverflow-Chatbot): refresh demo videos & docs for AI coach + adaptive features
- Rebuilt both videos from real footage of the running app:
  - GateOverflow-Chatbot-Feature-Guide.mp4 (detailed, 28 scenes, ~9 min)
  - GateOverflow-Chatbot-Demo.mp4 (concise, 18 scenes, ~4 min)
  New scenes: AI Coach, adaptive weak-area practice, instant next-steps,
  dashboard rank band/percentile trend/weekly, plan-adherence.
- Updated documentation DOCX (feature catalogue §3.11 + new API endpoints) and
  DEMO_SCRIPT. Added demo/live stills (22–26).

Co-Authored-By: Claude Opus 4.8 (1M context) <noreply@anthropic.com>
</commit_message>
<xml_diff>
--- a/18.Utilities/E.GATE-CS-DA-Chatbot/demo/GateOverflow-Chatbot-Demo.docx
+++ b/18.Utilities/E.GATE-CS-DA-Chatbot/demo/GateOverflow-Chatbot-Demo.docx
@@ -1294,7 +1294,93 @@
         <w:rPr>
           <w:color w:val="0F172A"/>
         </w:rPr>
-        <w:t>3.11 Persistence, branding &amp; platform</w:t>
+        <w:t>3.11 AI Coach &amp; personalized performance feedback</w:t>
+      </w:r>
+    </w:p>
+    <w:p>
+      <w:pPr>
+        <w:pStyle w:val="ListBullet"/>
+        <w:ind w:left="360"/>
+      </w:pPr>
+      <w:r>
+        <w:rPr>
+          <w:b/>
+        </w:rPr>
+        <w:t>AI Coach</w:t>
+      </w:r>
+      <w:r>
+        <w:t xml:space="preserve"> — on the Dashboard, analyses the student's own attempts, weak areas, streak, readiness and study plan and returns rank-focused coaching: strengths, focus areas, a this-week action plan, the single biggest lever for a top rank, and consistency feedback. ChatGPT can't — it doesn't know the student.</w:t>
+      </w:r>
+    </w:p>
+    <w:p>
+      <w:pPr>
+        <w:pStyle w:val="ListBullet"/>
+        <w:ind w:left="360"/>
+      </w:pPr>
+      <w:r>
+        <w:rPr>
+          <w:b/>
+        </w:rPr>
+        <w:t>Adaptive weak-area practice</w:t>
+      </w:r>
+      <w:r>
+        <w:t xml:space="preserve"> — one click ('Practice my weak areas' / 'Practice these now') generates a quiz targeting the weakest subjects auto-detected from the dashboard.</w:t>
+      </w:r>
+    </w:p>
+    <w:p>
+      <w:pPr>
+        <w:pStyle w:val="ListBullet"/>
+        <w:ind w:left="360"/>
+      </w:pPr>
+      <w:r>
+        <w:rPr>
+          <w:b/>
+        </w:rPr>
+        <w:t>Per-mock instant next-steps</w:t>
+      </w:r>
+      <w:r>
+        <w:t xml:space="preserve"> — every test ends with a clear 'what to do next' focus and one-click practice; missed questions auto-become flashcards.</w:t>
+      </w:r>
+    </w:p>
+    <w:p>
+      <w:pPr>
+        <w:pStyle w:val="ListBullet"/>
+        <w:ind w:left="360"/>
+      </w:pPr>
+      <w:r>
+        <w:rPr>
+          <w:b/>
+        </w:rPr>
+        <w:t>Estimated rank band &amp; percentile trend</w:t>
+      </w:r>
+      <w:r>
+        <w:t xml:space="preserve"> — a heuristic AIR band from average percentile, a percentile-trend sparkline, and a last-7-days activity summary.</w:t>
+      </w:r>
+    </w:p>
+    <w:p>
+      <w:pPr>
+        <w:pStyle w:val="ListBullet"/>
+        <w:ind w:left="360"/>
+      </w:pPr>
+      <w:r>
+        <w:rPr>
+          <w:b/>
+        </w:rPr>
+        <w:t>Plan-adherence feedback</w:t>
+      </w:r>
+      <w:r>
+        <w:t xml:space="preserve"> — the planner compares active days vs the plan and tells the student if they're on track or behind, with a nudge to catch up.</w:t>
+      </w:r>
+    </w:p>
+    <w:p>
+      <w:pPr>
+        <w:pStyle w:val="Heading2"/>
+      </w:pPr>
+      <w:r>
+        <w:rPr>
+          <w:color w:val="0F172A"/>
+        </w:rPr>
+        <w:t>3.12 Persistence, branding &amp; platform</w:t>
       </w:r>
     </w:p>
     <w:p>
@@ -2342,6 +2428,66 @@
               <w:rPr>
                 <w:sz w:val="19"/>
               </w:rPr>
+              <w:t>GET /coach</w:t>
+            </w:r>
+          </w:p>
+        </w:tc>
+        <w:tc>
+          <w:tcPr>
+            <w:tcW w:type="dxa" w:w="4320"/>
+          </w:tcPr>
+          <w:p>
+            <w:r/>
+            <w:r>
+              <w:rPr>
+                <w:sz w:val="19"/>
+              </w:rPr>
+              <w:t>AI coach: personalized rank-focused feedback</w:t>
+            </w:r>
+          </w:p>
+        </w:tc>
+      </w:tr>
+      <w:tr>
+        <w:tc>
+          <w:tcPr>
+            <w:tcW w:type="dxa" w:w="4320"/>
+          </w:tcPr>
+          <w:p>
+            <w:r/>
+            <w:r>
+              <w:rPr>
+                <w:sz w:val="19"/>
+              </w:rPr>
+              <w:t>GET /quiz/adaptive</w:t>
+            </w:r>
+          </w:p>
+        </w:tc>
+        <w:tc>
+          <w:tcPr>
+            <w:tcW w:type="dxa" w:w="4320"/>
+          </w:tcPr>
+          <w:p>
+            <w:r/>
+            <w:r>
+              <w:rPr>
+                <w:sz w:val="19"/>
+              </w:rPr>
+              <w:t>Generate a quiz targeting the weakest subjects</w:t>
+            </w:r>
+          </w:p>
+        </w:tc>
+      </w:tr>
+      <w:tr>
+        <w:tc>
+          <w:tcPr>
+            <w:tcW w:type="dxa" w:w="4320"/>
+          </w:tcPr>
+          <w:p>
+            <w:r/>
+            <w:r>
+              <w:rPr>
+                <w:sz w:val="19"/>
+              </w:rPr>
               <w:t>GET /meta, /health, /admin/stats</w:t>
             </w:r>
           </w:p>

</xml_diff>